<commit_message>
Update DOAJ report with findings from journal site review
Co-Authored-By: Claude Opus 5.5 <noreply@anthropic.com>
Claude-Session: https://claude.ai/code/session_01SkqonMVP493fzj7xrMiHTb
</commit_message>
<xml_diff>
--- a/rapor/MRR_DOAJ_Duzeltme_Raporu.docx
+++ b/rapor/MRR_DOAJ_Duzeltme_Raporu.docx
@@ -58,7 +58,7 @@
         <w:t xml:space="preserve">Hazırlanma tarihi:</w:t>
       </w:r>
       <w:r>
-        <w:t xml:space="preserve"> 28 Eylül 2026</w:t>
+        <w:t xml:space="preserve"> 28 Eylül 2026 (Sürüm 2: dergi sitesi incelemesi eklendi)</w:t>
       </w:r>
     </w:p>
     <w:p>
@@ -151,7 +151,7 @@
                 <w:sz w:val="20"/>
                 <w:szCs w:val="20"/>
               </w:rPr>
-              <w:t xml:space="preserve">Bu rapor, DOAJ’ın ret e-postasında alıntıladığı ifadelere ve DOAJ’ın yayımlanmış temel kabul kriterlerine dayanmaktadır. Raporun hazırlandığı ortamdan dergipark.org.tr ve doaj.org adreslerine ağ erişimi yoktu. Bu yüzden sitedeki sayfalar ayrıca açılıp okunamadı. Aşağıdaki “Genel uyum kontrol listesi” bölümü, sitede tek tek kontrol edilmesi gereken noktaları bu nedenle kontrol listesi olarak veriyor.</w:t>
+              <w:t xml:space="preserve">Bu rapor, DOAJ’ın ret e-postasında alıntıladığı ifadelere ve DOAJ’ın yayımlanmış temel kabul kriterlerine dayanmaktadır. Raporun hazırlandığı ortamdan dergipark.org.tr ve doaj.org adreslerine doğrudan erişim yoktu. Derginin sayfaları (Ana sayfa, About, Aim &amp; Scope, Author Guidelines) bu nedenle arama motorunun dizinlediği içerik üzerinden incelendi (Sürüm 2). Bulgular Bölüm 1.2’de yer alıyor. Arama motoru içeriği güncel sayfanın birebir aynısı olmayabilir, bu yüzden alıntılanan ifadeleri sitede ayrıca doğrulayın.</w:t>
             </w:r>
           </w:p>
         </w:tc>
@@ -670,6 +670,819 @@
       </w:r>
     </w:p>
     <w:p>
+      <w:pPr>
+        <w:pStyle w:val="Heading2"/>
+        <w:spacing w:after="120" w:before="240"/>
+      </w:pPr>
+      <w:r>
+        <w:t xml:space="preserve">1.2 Dergi sitesinin incelenmesi: yeni bulgular</w:t>
+      </w:r>
+    </w:p>
+    <w:p>
+      <w:pPr>
+        <w:spacing w:after="120" w:line="276"/>
+      </w:pPr>
+      <w:r>
+        <w:t xml:space="preserve">dergipark.org.tr/en/pub/mrr adresinin Ana sayfa, About, Aim &amp; Scope ve Author Guidelines sayfalarında DOAJ’ın e-postada saymadığı ama yeniden başvuruda sorun çıkaracak ifadeler var:</w:t>
+      </w:r>
+    </w:p>
+    <w:tbl>
+      <w:tblPr>
+        <w:tblW w:type="dxa" w:w="9026"/>
+        <w:tblBorders>
+          <w:top w:val="single" w:color="auto" w:sz="4"/>
+          <w:left w:val="single" w:color="auto" w:sz="4"/>
+          <w:bottom w:val="single" w:color="auto" w:sz="4"/>
+          <w:right w:val="single" w:color="auto" w:sz="4"/>
+          <w:insideH w:val="single" w:color="auto" w:sz="4"/>
+          <w:insideV w:val="single" w:color="auto" w:sz="4"/>
+        </w:tblBorders>
+      </w:tblPr>
+      <w:tblGrid>
+        <w:gridCol w:w="2306"/>
+        <w:gridCol w:w="3610"/>
+        <w:gridCol w:w="3110"/>
+      </w:tblGrid>
+      <w:tr>
+        <w:trPr>
+          <w:tblHeader/>
+        </w:trPr>
+        <w:tc>
+          <w:tcPr>
+            <w:tcW w:type="dxa" w:w="2306"/>
+            <w:tcBorders>
+              <w:top w:val="single" w:color="BFBFBF" w:sz="4"/>
+              <w:left w:val="single" w:color="BFBFBF" w:sz="4"/>
+              <w:bottom w:val="single" w:color="BFBFBF" w:sz="4"/>
+              <w:right w:val="single" w:color="BFBFBF" w:sz="4"/>
+            </w:tcBorders>
+            <w:shd w:fill="1F4E79" w:color="auto" w:val="clear"/>
+            <w:tcMar>
+              <w:top w:type="dxa" w:w="80"/>
+              <w:left w:type="dxa" w:w="100"/>
+              <w:bottom w:type="dxa" w:w="80"/>
+              <w:right w:type="dxa" w:w="100"/>
+            </w:tcMar>
+          </w:tcPr>
+          <w:p>
+            <w:pPr>
+              <w:spacing w:after="40"/>
+            </w:pPr>
+            <w:r>
+              <w:rPr>
+                <w:b/>
+                <w:bCs/>
+                <w:color w:val="FFFFFF"/>
+              </w:rPr>
+              <w:t xml:space="preserve">Bulgu</w:t>
+            </w:r>
+          </w:p>
+        </w:tc>
+        <w:tc>
+          <w:tcPr>
+            <w:tcW w:type="dxa" w:w="3610"/>
+            <w:tcBorders>
+              <w:top w:val="single" w:color="BFBFBF" w:sz="4"/>
+              <w:left w:val="single" w:color="BFBFBF" w:sz="4"/>
+              <w:bottom w:val="single" w:color="BFBFBF" w:sz="4"/>
+              <w:right w:val="single" w:color="BFBFBF" w:sz="4"/>
+            </w:tcBorders>
+            <w:shd w:fill="1F4E79" w:color="auto" w:val="clear"/>
+            <w:tcMar>
+              <w:top w:type="dxa" w:w="80"/>
+              <w:left w:type="dxa" w:w="100"/>
+              <w:bottom w:type="dxa" w:w="80"/>
+              <w:right w:type="dxa" w:w="100"/>
+            </w:tcMar>
+          </w:tcPr>
+          <w:p>
+            <w:pPr>
+              <w:spacing w:after="40"/>
+            </w:pPr>
+            <w:r>
+              <w:rPr>
+                <w:b/>
+                <w:bCs/>
+                <w:color w:val="FFFFFF"/>
+              </w:rPr>
+              <w:t xml:space="preserve">Sitede görünen ifade</w:t>
+            </w:r>
+          </w:p>
+        </w:tc>
+        <w:tc>
+          <w:tcPr>
+            <w:tcW w:type="dxa" w:w="3110"/>
+            <w:tcBorders>
+              <w:top w:val="single" w:color="BFBFBF" w:sz="4"/>
+              <w:left w:val="single" w:color="BFBFBF" w:sz="4"/>
+              <w:bottom w:val="single" w:color="BFBFBF" w:sz="4"/>
+              <w:right w:val="single" w:color="BFBFBF" w:sz="4"/>
+            </w:tcBorders>
+            <w:shd w:fill="1F4E79" w:color="auto" w:val="clear"/>
+            <w:tcMar>
+              <w:top w:type="dxa" w:w="80"/>
+              <w:left w:type="dxa" w:w="100"/>
+              <w:bottom w:type="dxa" w:w="80"/>
+              <w:right w:type="dxa" w:w="100"/>
+            </w:tcMar>
+          </w:tcPr>
+          <w:p>
+            <w:pPr>
+              <w:spacing w:after="40"/>
+            </w:pPr>
+            <w:r>
+              <w:rPr>
+                <w:b/>
+                <w:bCs/>
+                <w:color w:val="FFFFFF"/>
+              </w:rPr>
+              <w:t xml:space="preserve">Sorun / yapılacak</w:t>
+            </w:r>
+          </w:p>
+        </w:tc>
+      </w:tr>
+      <w:tr>
+        <w:tc>
+          <w:tcPr>
+            <w:tcW w:type="dxa" w:w="2306"/>
+            <w:tcBorders>
+              <w:top w:val="single" w:color="BFBFBF" w:sz="4"/>
+              <w:left w:val="single" w:color="BFBFBF" w:sz="4"/>
+              <w:bottom w:val="single" w:color="BFBFBF" w:sz="4"/>
+              <w:right w:val="single" w:color="BFBFBF" w:sz="4"/>
+            </w:tcBorders>
+            <w:tcMar>
+              <w:top w:type="dxa" w:w="80"/>
+              <w:left w:type="dxa" w:w="100"/>
+              <w:bottom w:type="dxa" w:w="80"/>
+              <w:right w:type="dxa" w:w="100"/>
+            </w:tcMar>
+          </w:tcPr>
+          <w:p>
+            <w:pPr>
+              <w:spacing w:after="40"/>
+            </w:pPr>
+            <w:r>
+              <w:rPr>
+                <w:b/>
+                <w:bCs/>
+              </w:rPr>
+              <w:t xml:space="preserve">Telif: 5. çelişki (YENİ)</w:t>
+            </w:r>
+          </w:p>
+        </w:tc>
+        <w:tc>
+          <w:tcPr>
+            <w:tcW w:type="dxa" w:w="3610"/>
+            <w:tcBorders>
+              <w:top w:val="single" w:color="BFBFBF" w:sz="4"/>
+              <w:left w:val="single" w:color="BFBFBF" w:sz="4"/>
+              <w:bottom w:val="single" w:color="BFBFBF" w:sz="4"/>
+              <w:right w:val="single" w:color="BFBFBF" w:sz="4"/>
+            </w:tcBorders>
+            <w:tcMar>
+              <w:top w:type="dxa" w:w="80"/>
+              <w:left w:type="dxa" w:w="100"/>
+              <w:bottom w:type="dxa" w:w="80"/>
+              <w:right w:type="dxa" w:w="100"/>
+            </w:tcMar>
+          </w:tcPr>
+          <w:p>
+            <w:pPr>
+              <w:spacing w:after="40"/>
+            </w:pPr>
+            <w:r>
+              <w:t xml:space="preserve">“The published article is the property of the journal and the publishing rights are transferred to the journal.” (Ana sayfa / About)</w:t>
+            </w:r>
+          </w:p>
+        </w:tc>
+        <w:tc>
+          <w:tcPr>
+            <w:tcW w:type="dxa" w:w="3110"/>
+            <w:tcBorders>
+              <w:top w:val="single" w:color="BFBFBF" w:sz="4"/>
+              <w:left w:val="single" w:color="BFBFBF" w:sz="4"/>
+              <w:bottom w:val="single" w:color="BFBFBF" w:sz="4"/>
+              <w:right w:val="single" w:color="BFBFBF" w:sz="4"/>
+            </w:tcBorders>
+            <w:tcMar>
+              <w:top w:type="dxa" w:w="80"/>
+              <w:left w:type="dxa" w:w="100"/>
+              <w:bottom w:type="dxa" w:w="80"/>
+              <w:right w:type="dxa" w:w="100"/>
+            </w:tcMar>
+          </w:tcPr>
+          <w:p>
+            <w:pPr>
+              <w:spacing w:after="40"/>
+            </w:pPr>
+            <w:r>
+              <w:t xml:space="preserve">Bu cümle telifin dergide olduğunu söylüyor. 12771 ve 12772 numaralı sayfalar ise “authors own the copyright” diyor. DOAJ’ın saydığı dört çelişkiye ek olarak beşinci bir çelişki. Cümle silinmeli ve yerine standart metin (Bölüm 2.3) konmalı.</w:t>
+            </w:r>
+          </w:p>
+        </w:tc>
+      </w:tr>
+      <w:tr>
+        <w:tc>
+          <w:tcPr>
+            <w:tcW w:type="dxa" w:w="2306"/>
+            <w:tcBorders>
+              <w:top w:val="single" w:color="BFBFBF" w:sz="4"/>
+              <w:left w:val="single" w:color="BFBFBF" w:sz="4"/>
+              <w:bottom w:val="single" w:color="BFBFBF" w:sz="4"/>
+              <w:right w:val="single" w:color="BFBFBF" w:sz="4"/>
+            </w:tcBorders>
+            <w:shd w:fill="F2F6FA" w:color="auto" w:val="clear"/>
+            <w:tcMar>
+              <w:top w:type="dxa" w:w="80"/>
+              <w:left w:type="dxa" w:w="100"/>
+              <w:bottom w:type="dxa" w:w="80"/>
+              <w:right w:type="dxa" w:w="100"/>
+            </w:tcMar>
+          </w:tcPr>
+          <w:p>
+            <w:pPr>
+              <w:spacing w:after="40"/>
+            </w:pPr>
+            <w:r>
+              <w:rPr>
+                <w:b/>
+                <w:bCs/>
+              </w:rPr>
+              <w:t xml:space="preserve">Lisans adı yanlış (YENİ)</w:t>
+            </w:r>
+          </w:p>
+        </w:tc>
+        <w:tc>
+          <w:tcPr>
+            <w:tcW w:type="dxa" w:w="3610"/>
+            <w:tcBorders>
+              <w:top w:val="single" w:color="BFBFBF" w:sz="4"/>
+              <w:left w:val="single" w:color="BFBFBF" w:sz="4"/>
+              <w:bottom w:val="single" w:color="BFBFBF" w:sz="4"/>
+              <w:right w:val="single" w:color="BFBFBF" w:sz="4"/>
+            </w:tcBorders>
+            <w:shd w:fill="F2F6FA" w:color="auto" w:val="clear"/>
+            <w:tcMar>
+              <w:top w:type="dxa" w:w="80"/>
+              <w:left w:type="dxa" w:w="100"/>
+              <w:bottom w:type="dxa" w:w="80"/>
+              <w:right w:type="dxa" w:w="100"/>
+            </w:tcMar>
+          </w:tcPr>
+          <w:p>
+            <w:pPr>
+              <w:spacing w:after="40"/>
+            </w:pPr>
+            <w:r>
+              <w:t xml:space="preserve">“All site content is licensed under a Creative Commons Attribution Licence (CC-BY-NC 4.0)”</w:t>
+            </w:r>
+          </w:p>
+        </w:tc>
+        <w:tc>
+          <w:tcPr>
+            <w:tcW w:type="dxa" w:w="3110"/>
+            <w:tcBorders>
+              <w:top w:val="single" w:color="BFBFBF" w:sz="4"/>
+              <w:left w:val="single" w:color="BFBFBF" w:sz="4"/>
+              <w:bottom w:val="single" w:color="BFBFBF" w:sz="4"/>
+              <w:right w:val="single" w:color="BFBFBF" w:sz="4"/>
+            </w:tcBorders>
+            <w:shd w:fill="F2F6FA" w:color="auto" w:val="clear"/>
+            <w:tcMar>
+              <w:top w:type="dxa" w:w="80"/>
+              <w:left w:type="dxa" w:w="100"/>
+              <w:bottom w:type="dxa" w:w="80"/>
+              <w:right w:type="dxa" w:w="100"/>
+            </w:tcMar>
+          </w:tcPr>
+          <w:p>
+            <w:pPr>
+              <w:spacing w:after="40"/>
+            </w:pPr>
+            <w:r>
+              <w:t xml:space="preserve">“Creative Commons Attribution Licence” CC BY’nin adıdır. CC BY-NC’nin doğru adı “Creative Commons Attribution-NonCommercial 4.0 International License”. Ayrıca lisansın yalnızca “site content” için değil, </w:t>
+            </w:r>
+            <w:r>
+              <w:rPr>
+                <w:b/>
+                <w:bCs/>
+              </w:rPr>
+              <w:t xml:space="preserve">yayımlanan makaleler</w:t>
+            </w:r>
+            <w:r>
+              <w:t xml:space="preserve"> için geçerli olduğu yazılmalı.</w:t>
+            </w:r>
+          </w:p>
+        </w:tc>
+      </w:tr>
+      <w:tr>
+        <w:tc>
+          <w:tcPr>
+            <w:tcW w:type="dxa" w:w="2306"/>
+            <w:tcBorders>
+              <w:top w:val="single" w:color="BFBFBF" w:sz="4"/>
+              <w:left w:val="single" w:color="BFBFBF" w:sz="4"/>
+              <w:bottom w:val="single" w:color="BFBFBF" w:sz="4"/>
+              <w:right w:val="single" w:color="BFBFBF" w:sz="4"/>
+            </w:tcBorders>
+            <w:tcMar>
+              <w:top w:type="dxa" w:w="80"/>
+              <w:left w:type="dxa" w:w="100"/>
+              <w:bottom w:type="dxa" w:w="80"/>
+              <w:right w:type="dxa" w:w="100"/>
+            </w:tcMar>
+          </w:tcPr>
+          <w:p>
+            <w:pPr>
+              <w:spacing w:after="40"/>
+            </w:pPr>
+            <w:r>
+              <w:rPr>
+                <w:b/>
+                <w:bCs/>
+              </w:rPr>
+              <w:t xml:space="preserve">Yayın dili çelişkisi (YENİ)</w:t>
+            </w:r>
+          </w:p>
+        </w:tc>
+        <w:tc>
+          <w:tcPr>
+            <w:tcW w:type="dxa" w:w="3610"/>
+            <w:tcBorders>
+              <w:top w:val="single" w:color="BFBFBF" w:sz="4"/>
+              <w:left w:val="single" w:color="BFBFBF" w:sz="4"/>
+              <w:bottom w:val="single" w:color="BFBFBF" w:sz="4"/>
+              <w:right w:val="single" w:color="BFBFBF" w:sz="4"/>
+            </w:tcBorders>
+            <w:tcMar>
+              <w:top w:type="dxa" w:w="80"/>
+              <w:left w:type="dxa" w:w="100"/>
+              <w:bottom w:type="dxa" w:w="80"/>
+              <w:right w:type="dxa" w:w="100"/>
+            </w:tcMar>
+          </w:tcPr>
+          <w:p>
+            <w:pPr>
+              <w:spacing w:after="40"/>
+            </w:pPr>
+            <w:r>
+              <w:t xml:space="preserve">Bir yerde “Published papers in this journal will be in English and Turkish”, başka bir yerde “Starting in 2026, the journal will exclusively consider manuscripts submitted in English”.</w:t>
+            </w:r>
+          </w:p>
+        </w:tc>
+        <w:tc>
+          <w:tcPr>
+            <w:tcW w:type="dxa" w:w="3110"/>
+            <w:tcBorders>
+              <w:top w:val="single" w:color="BFBFBF" w:sz="4"/>
+              <w:left w:val="single" w:color="BFBFBF" w:sz="4"/>
+              <w:bottom w:val="single" w:color="BFBFBF" w:sz="4"/>
+              <w:right w:val="single" w:color="BFBFBF" w:sz="4"/>
+            </w:tcBorders>
+            <w:tcMar>
+              <w:top w:type="dxa" w:w="80"/>
+              <w:left w:type="dxa" w:w="100"/>
+              <w:bottom w:type="dxa" w:w="80"/>
+              <w:right w:type="dxa" w:w="100"/>
+            </w:tcMar>
+          </w:tcPr>
+          <w:p>
+            <w:pPr>
+              <w:spacing w:after="40"/>
+            </w:pPr>
+            <w:r>
+              <w:t xml:space="preserve">DOAJ başvuru formunda yayın dili soruluyor. Tek bir politika belirlenmeli (ör. “Since 2026, the journal publishes articles in English only.”) ve bütün sayfalar buna göre güncellenmeli.</w:t>
+            </w:r>
+          </w:p>
+        </w:tc>
+      </w:tr>
+      <w:tr>
+        <w:tc>
+          <w:tcPr>
+            <w:tcW w:type="dxa" w:w="2306"/>
+            <w:tcBorders>
+              <w:top w:val="single" w:color="BFBFBF" w:sz="4"/>
+              <w:left w:val="single" w:color="BFBFBF" w:sz="4"/>
+              <w:bottom w:val="single" w:color="BFBFBF" w:sz="4"/>
+              <w:right w:val="single" w:color="BFBFBF" w:sz="4"/>
+            </w:tcBorders>
+            <w:shd w:fill="F2F6FA" w:color="auto" w:val="clear"/>
+            <w:tcMar>
+              <w:top w:type="dxa" w:w="80"/>
+              <w:left w:type="dxa" w:w="100"/>
+              <w:bottom w:type="dxa" w:w="80"/>
+              <w:right w:type="dxa" w:w="100"/>
+            </w:tcMar>
+          </w:tcPr>
+          <w:p>
+            <w:pPr>
+              <w:spacing w:after="40"/>
+            </w:pPr>
+            <w:r>
+              <w:t xml:space="preserve">Hakem türü: kısmen mevcut</w:t>
+            </w:r>
+          </w:p>
+        </w:tc>
+        <w:tc>
+          <w:tcPr>
+            <w:tcW w:type="dxa" w:w="3610"/>
+            <w:tcBorders>
+              <w:top w:val="single" w:color="BFBFBF" w:sz="4"/>
+              <w:left w:val="single" w:color="BFBFBF" w:sz="4"/>
+              <w:bottom w:val="single" w:color="BFBFBF" w:sz="4"/>
+              <w:right w:val="single" w:color="BFBFBF" w:sz="4"/>
+            </w:tcBorders>
+            <w:shd w:fill="F2F6FA" w:color="auto" w:val="clear"/>
+            <w:tcMar>
+              <w:top w:type="dxa" w:w="80"/>
+              <w:left w:type="dxa" w:w="100"/>
+              <w:bottom w:type="dxa" w:w="80"/>
+              <w:right w:type="dxa" w:w="100"/>
+            </w:tcMar>
+          </w:tcPr>
+          <w:p>
+            <w:pPr>
+              <w:spacing w:after="40"/>
+            </w:pPr>
+            <w:r>
+              <w:t xml:space="preserve">“…based on the principles of independent, unbiased, double-blind review”</w:t>
+            </w:r>
+          </w:p>
+        </w:tc>
+        <w:tc>
+          <w:tcPr>
+            <w:tcW w:type="dxa" w:w="3110"/>
+            <w:tcBorders>
+              <w:top w:val="single" w:color="BFBFBF" w:sz="4"/>
+              <w:left w:val="single" w:color="BFBFBF" w:sz="4"/>
+              <w:bottom w:val="single" w:color="BFBFBF" w:sz="4"/>
+              <w:right w:val="single" w:color="BFBFBF" w:sz="4"/>
+            </w:tcBorders>
+            <w:shd w:fill="F2F6FA" w:color="auto" w:val="clear"/>
+            <w:tcMar>
+              <w:top w:type="dxa" w:w="80"/>
+              <w:left w:type="dxa" w:w="100"/>
+              <w:bottom w:type="dxa" w:w="80"/>
+              <w:right w:type="dxa" w:w="100"/>
+            </w:tcMar>
+          </w:tcPr>
+          <w:p>
+            <w:pPr>
+              <w:spacing w:after="40"/>
+            </w:pPr>
+            <w:r>
+              <w:t xml:space="preserve">Çift kör değerlendirme ana sayfada yazıyor ama DOAJ bunu hakem süreci sayfasında (13691) göremediğini belirtmiş. Bölüm 3.2’deki metin 13691’e eklenmeli. Hakemlerin yayın kurulu dışından olduğu ise hiçbir yerde yazmıyor.</w:t>
+            </w:r>
+          </w:p>
+        </w:tc>
+      </w:tr>
+      <w:tr>
+        <w:tc>
+          <w:tcPr>
+            <w:tcW w:type="dxa" w:w="2306"/>
+            <w:tcBorders>
+              <w:top w:val="single" w:color="BFBFBF" w:sz="4"/>
+              <w:left w:val="single" w:color="BFBFBF" w:sz="4"/>
+              <w:bottom w:val="single" w:color="BFBFBF" w:sz="4"/>
+              <w:right w:val="single" w:color="BFBFBF" w:sz="4"/>
+            </w:tcBorders>
+            <w:tcMar>
+              <w:top w:type="dxa" w:w="80"/>
+              <w:left w:type="dxa" w:w="100"/>
+              <w:bottom w:type="dxa" w:w="80"/>
+              <w:right w:type="dxa" w:w="100"/>
+            </w:tcMar>
+          </w:tcPr>
+          <w:p>
+            <w:pPr>
+              <w:spacing w:after="40"/>
+            </w:pPr>
+            <w:r>
+              <w:t xml:space="preserve">Ücretler: uygun</w:t>
+            </w:r>
+          </w:p>
+        </w:tc>
+        <w:tc>
+          <w:tcPr>
+            <w:tcW w:type="dxa" w:w="3610"/>
+            <w:tcBorders>
+              <w:top w:val="single" w:color="BFBFBF" w:sz="4"/>
+              <w:left w:val="single" w:color="BFBFBF" w:sz="4"/>
+              <w:bottom w:val="single" w:color="BFBFBF" w:sz="4"/>
+              <w:right w:val="single" w:color="BFBFBF" w:sz="4"/>
+            </w:tcBorders>
+            <w:tcMar>
+              <w:top w:type="dxa" w:w="80"/>
+              <w:left w:type="dxa" w:w="100"/>
+              <w:bottom w:type="dxa" w:w="80"/>
+              <w:right w:type="dxa" w:w="100"/>
+            </w:tcMar>
+          </w:tcPr>
+          <w:p>
+            <w:pPr>
+              <w:spacing w:after="40"/>
+            </w:pPr>
+            <w:r>
+              <w:t xml:space="preserve">“…open-access journal and the registration, submit and publication of the article is free.”</w:t>
+            </w:r>
+          </w:p>
+        </w:tc>
+        <w:tc>
+          <w:tcPr>
+            <w:tcW w:type="dxa" w:w="3110"/>
+            <w:tcBorders>
+              <w:top w:val="single" w:color="BFBFBF" w:sz="4"/>
+              <w:left w:val="single" w:color="BFBFBF" w:sz="4"/>
+              <w:bottom w:val="single" w:color="BFBFBF" w:sz="4"/>
+              <w:right w:val="single" w:color="BFBFBF" w:sz="4"/>
+            </w:tcBorders>
+            <w:tcMar>
+              <w:top w:type="dxa" w:w="80"/>
+              <w:left w:type="dxa" w:w="100"/>
+              <w:bottom w:type="dxa" w:w="80"/>
+              <w:right w:type="dxa" w:w="100"/>
+            </w:tcMar>
+          </w:tcPr>
+          <w:p>
+            <w:pPr>
+              <w:spacing w:after="40"/>
+            </w:pPr>
+            <w:r>
+              <w:t xml:space="preserve">Uygun. DOAJ formunda “No APC” olarak işaretleyin. Metin İngilizce olarak şöyle düzeltilebilir: “The journal does not charge any submission, processing or publication fees.”</w:t>
+            </w:r>
+          </w:p>
+        </w:tc>
+      </w:tr>
+      <w:tr>
+        <w:tc>
+          <w:tcPr>
+            <w:tcW w:type="dxa" w:w="2306"/>
+            <w:tcBorders>
+              <w:top w:val="single" w:color="BFBFBF" w:sz="4"/>
+              <w:left w:val="single" w:color="BFBFBF" w:sz="4"/>
+              <w:bottom w:val="single" w:color="BFBFBF" w:sz="4"/>
+              <w:right w:val="single" w:color="BFBFBF" w:sz="4"/>
+            </w:tcBorders>
+            <w:shd w:fill="F2F6FA" w:color="auto" w:val="clear"/>
+            <w:tcMar>
+              <w:top w:type="dxa" w:w="80"/>
+              <w:left w:type="dxa" w:w="100"/>
+              <w:bottom w:type="dxa" w:w="80"/>
+              <w:right w:type="dxa" w:w="100"/>
+            </w:tcMar>
+          </w:tcPr>
+          <w:p>
+            <w:pPr>
+              <w:spacing w:after="40"/>
+            </w:pPr>
+            <w:r>
+              <w:t xml:space="preserve">Yayın sıklığı: uygun</w:t>
+            </w:r>
+          </w:p>
+        </w:tc>
+        <w:tc>
+          <w:tcPr>
+            <w:tcW w:type="dxa" w:w="3610"/>
+            <w:tcBorders>
+              <w:top w:val="single" w:color="BFBFBF" w:sz="4"/>
+              <w:left w:val="single" w:color="BFBFBF" w:sz="4"/>
+              <w:bottom w:val="single" w:color="BFBFBF" w:sz="4"/>
+              <w:right w:val="single" w:color="BFBFBF" w:sz="4"/>
+            </w:tcBorders>
+            <w:shd w:fill="F2F6FA" w:color="auto" w:val="clear"/>
+            <w:tcMar>
+              <w:top w:type="dxa" w:w="80"/>
+              <w:left w:type="dxa" w:w="100"/>
+              <w:bottom w:type="dxa" w:w="80"/>
+              <w:right w:type="dxa" w:w="100"/>
+            </w:tcMar>
+          </w:tcPr>
+          <w:p>
+            <w:pPr>
+              <w:spacing w:after="40"/>
+            </w:pPr>
+            <w:r>
+              <w:t xml:space="preserve">“…published every four (4) months, three (3) times a year.”</w:t>
+            </w:r>
+          </w:p>
+        </w:tc>
+        <w:tc>
+          <w:tcPr>
+            <w:tcW w:type="dxa" w:w="3110"/>
+            <w:tcBorders>
+              <w:top w:val="single" w:color="BFBFBF" w:sz="4"/>
+              <w:left w:val="single" w:color="BFBFBF" w:sz="4"/>
+              <w:bottom w:val="single" w:color="BFBFBF" w:sz="4"/>
+              <w:right w:val="single" w:color="BFBFBF" w:sz="4"/>
+            </w:tcBorders>
+            <w:shd w:fill="F2F6FA" w:color="auto" w:val="clear"/>
+            <w:tcMar>
+              <w:top w:type="dxa" w:w="80"/>
+              <w:left w:type="dxa" w:w="100"/>
+              <w:bottom w:type="dxa" w:w="80"/>
+              <w:right w:type="dxa" w:w="100"/>
+            </w:tcMar>
+          </w:tcPr>
+          <w:p>
+            <w:pPr>
+              <w:spacing w:after="40"/>
+            </w:pPr>
+            <w:r>
+              <w:t xml:space="preserve">Uygun. Ayların (ör. Nisan, Ağustos, Aralık) belirtilmesi ve sayıların zamanında çıkması önerilir.</w:t>
+            </w:r>
+          </w:p>
+        </w:tc>
+      </w:tr>
+      <w:tr>
+        <w:tc>
+          <w:tcPr>
+            <w:tcW w:type="dxa" w:w="2306"/>
+            <w:tcBorders>
+              <w:top w:val="single" w:color="BFBFBF" w:sz="4"/>
+              <w:left w:val="single" w:color="BFBFBF" w:sz="4"/>
+              <w:bottom w:val="single" w:color="BFBFBF" w:sz="4"/>
+              <w:right w:val="single" w:color="BFBFBF" w:sz="4"/>
+            </w:tcBorders>
+            <w:tcMar>
+              <w:top w:type="dxa" w:w="80"/>
+              <w:left w:type="dxa" w:w="100"/>
+              <w:bottom w:type="dxa" w:w="80"/>
+              <w:right w:type="dxa" w:w="100"/>
+            </w:tcMar>
+          </w:tcPr>
+          <w:p>
+            <w:pPr>
+              <w:spacing w:after="40"/>
+            </w:pPr>
+            <w:r>
+              <w:t xml:space="preserve">Kalıcı tanımlayıcı: uygun</w:t>
+            </w:r>
+          </w:p>
+        </w:tc>
+        <w:tc>
+          <w:tcPr>
+            <w:tcW w:type="dxa" w:w="3610"/>
+            <w:tcBorders>
+              <w:top w:val="single" w:color="BFBFBF" w:sz="4"/>
+              <w:left w:val="single" w:color="BFBFBF" w:sz="4"/>
+              <w:bottom w:val="single" w:color="BFBFBF" w:sz="4"/>
+              <w:right w:val="single" w:color="BFBFBF" w:sz="4"/>
+            </w:tcBorders>
+            <w:tcMar>
+              <w:top w:type="dxa" w:w="80"/>
+              <w:left w:type="dxa" w:w="100"/>
+              <w:bottom w:type="dxa" w:w="80"/>
+              <w:right w:type="dxa" w:w="100"/>
+            </w:tcMar>
+          </w:tcPr>
+          <w:p>
+            <w:pPr>
+              <w:spacing w:after="40"/>
+            </w:pPr>
+            <w:r>
+              <w:t xml:space="preserve">Makalelerde DOI var (10.55517/mrr.…).</w:t>
+            </w:r>
+          </w:p>
+        </w:tc>
+        <w:tc>
+          <w:tcPr>
+            <w:tcW w:type="dxa" w:w="3110"/>
+            <w:tcBorders>
+              <w:top w:val="single" w:color="BFBFBF" w:sz="4"/>
+              <w:left w:val="single" w:color="BFBFBF" w:sz="4"/>
+              <w:bottom w:val="single" w:color="BFBFBF" w:sz="4"/>
+              <w:right w:val="single" w:color="BFBFBF" w:sz="4"/>
+            </w:tcBorders>
+            <w:tcMar>
+              <w:top w:type="dxa" w:w="80"/>
+              <w:left w:type="dxa" w:w="100"/>
+              <w:bottom w:type="dxa" w:w="80"/>
+              <w:right w:type="dxa" w:w="100"/>
+            </w:tcMar>
+          </w:tcPr>
+          <w:p>
+            <w:pPr>
+              <w:spacing w:after="40"/>
+            </w:pPr>
+            <w:r>
+              <w:t xml:space="preserve">Uygun. Başvuru formunda DOI kullanıldığını belirtin.</w:t>
+            </w:r>
+          </w:p>
+        </w:tc>
+      </w:tr>
+      <w:tr>
+        <w:tc>
+          <w:tcPr>
+            <w:tcW w:type="dxa" w:w="2306"/>
+            <w:tcBorders>
+              <w:top w:val="single" w:color="BFBFBF" w:sz="4"/>
+              <w:left w:val="single" w:color="BFBFBF" w:sz="4"/>
+              <w:bottom w:val="single" w:color="BFBFBF" w:sz="4"/>
+              <w:right w:val="single" w:color="BFBFBF" w:sz="4"/>
+            </w:tcBorders>
+            <w:shd w:fill="F2F6FA" w:color="auto" w:val="clear"/>
+            <w:tcMar>
+              <w:top w:type="dxa" w:w="80"/>
+              <w:left w:type="dxa" w:w="100"/>
+              <w:bottom w:type="dxa" w:w="80"/>
+              <w:right w:type="dxa" w:w="100"/>
+            </w:tcMar>
+          </w:tcPr>
+          <w:p>
+            <w:pPr>
+              <w:spacing w:after="40"/>
+            </w:pPr>
+            <w:r>
+              <w:t xml:space="preserve">PDF üst bilgisinde yazım hatası</w:t>
+            </w:r>
+          </w:p>
+        </w:tc>
+        <w:tc>
+          <w:tcPr>
+            <w:tcW w:type="dxa" w:w="3610"/>
+            <w:tcBorders>
+              <w:top w:val="single" w:color="BFBFBF" w:sz="4"/>
+              <w:left w:val="single" w:color="BFBFBF" w:sz="4"/>
+              <w:bottom w:val="single" w:color="BFBFBF" w:sz="4"/>
+              <w:right w:val="single" w:color="BFBFBF" w:sz="4"/>
+            </w:tcBorders>
+            <w:shd w:fill="F2F6FA" w:color="auto" w:val="clear"/>
+            <w:tcMar>
+              <w:top w:type="dxa" w:w="80"/>
+              <w:left w:type="dxa" w:w="100"/>
+              <w:bottom w:type="dxa" w:w="80"/>
+              <w:right w:type="dxa" w:w="100"/>
+            </w:tcMar>
+          </w:tcPr>
+          <w:p>
+            <w:pPr>
+              <w:spacing w:after="40"/>
+            </w:pPr>
+            <w:r>
+              <w:t xml:space="preserve">Bir makale PDF’inin üst bilgisinde “REWİE Med Res Rep 2023;6(3)” görünüyor.</w:t>
+            </w:r>
+          </w:p>
+        </w:tc>
+        <w:tc>
+          <w:tcPr>
+            <w:tcW w:type="dxa" w:w="3110"/>
+            <w:tcBorders>
+              <w:top w:val="single" w:color="BFBFBF" w:sz="4"/>
+              <w:left w:val="single" w:color="BFBFBF" w:sz="4"/>
+              <w:bottom w:val="single" w:color="BFBFBF" w:sz="4"/>
+              <w:right w:val="single" w:color="BFBFBF" w:sz="4"/>
+            </w:tcBorders>
+            <w:shd w:fill="F2F6FA" w:color="auto" w:val="clear"/>
+            <w:tcMar>
+              <w:top w:type="dxa" w:w="80"/>
+              <w:left w:type="dxa" w:w="100"/>
+              <w:bottom w:type="dxa" w:w="80"/>
+              <w:right w:type="dxa" w:w="100"/>
+            </w:tcMar>
+          </w:tcPr>
+          <w:p>
+            <w:pPr>
+              <w:spacing w:after="40"/>
+            </w:pPr>
+            <w:r>
+              <w:t xml:space="preserve">Makale türü etiketi “REVIEW” olmalı. Mizanpaj şablonundaki makale türü etiketlerini kontrol edin.</w:t>
+            </w:r>
+          </w:p>
+        </w:tc>
+      </w:tr>
+    </w:tbl>
+    <w:p>
+      <w:pPr>
+        <w:spacing w:after="120"/>
+      </w:pPr>
+    </w:p>
+    <w:p>
+      <w:pPr>
+        <w:spacing w:after="120" w:line="276"/>
+      </w:pPr>
+      <w:r>
+        <w:rPr>
+          <w:b/>
+          <w:bCs/>
+        </w:rPr>
+        <w:t xml:space="preserve">Sonuç:</w:t>
+      </w:r>
+      <w:r>
+        <w:t xml:space="preserve"> Sitede telif hakkıyla ilgili en az </w:t>
+      </w:r>
+      <w:r>
+        <w:rPr>
+          <w:b/>
+          <w:bCs/>
+        </w:rPr>
+        <w:t xml:space="preserve">beş</w:t>
+      </w:r>
+      <w:r>
+        <w:t xml:space="preserve"> farklı ifade var ve en az üç farklı sayfada lisans anlatımı birbirinden farklı. Bu yüzden Bölüm 2.4’teki tablo, Ana sayfa ve About sayfası eklenerek güncellendi.</w:t>
+      </w:r>
+    </w:p>
+    <w:p>
       <w:r>
         <w:br w:type="page"/>
       </w:r>
@@ -1975,7 +2788,7 @@
               <w:spacing w:after="40"/>
             </w:pPr>
             <w:r>
-              <w:t xml:space="preserve">Sayfa 12771</w:t>
+              <w:t xml:space="preserve">Ana sayfa ve About sayfası (YENİ)</w:t>
             </w:r>
           </w:p>
         </w:tc>
@@ -2000,7 +2813,7 @@
               <w:spacing w:after="40"/>
             </w:pPr>
             <w:r>
-              <w:t xml:space="preserve">“authors own the copyright but license exclusive rights…” cümlesini silin. Yerine 2.3’teki standart metni koyun.</w:t>
+              <w:t xml:space="preserve">“The published article is the property of the journal and the publishing rights are transferred to the journal.” cümlesini silin. “Creative Commons Attribution Licence (CC-BY-NC 4.0)” ifadesini “Creative Commons Attribution-NonCommercial 4.0 International License (CC BY-NC 4.0)” olarak düzeltin. Lisansın makaleler için geçerli olduğunu yazın.</w:t>
             </w:r>
           </w:p>
         </w:tc>
@@ -2028,7 +2841,7 @@
               <w:spacing w:after="40"/>
             </w:pPr>
             <w:r>
-              <w:t xml:space="preserve">Sayfa 12772</w:t>
+              <w:t xml:space="preserve">Sayfa 12771</w:t>
             </w:r>
           </w:p>
         </w:tc>
@@ -2054,7 +2867,7 @@
               <w:spacing w:after="40"/>
             </w:pPr>
             <w:r>
-              <w:t xml:space="preserve">“exclusive license agreement…” cümlesini silin. Yerine standart metni koyun. Sayfa başlığında “Copyright Transfer” ifadesi geçiyorsa “Copyright and License” olarak değiştirin.</w:t>
+              <w:t xml:space="preserve">“authors own the copyright but license exclusive rights…” cümlesini silin. Yerine 2.3’teki standart metni koyun.</w:t>
             </w:r>
           </w:p>
         </w:tc>
@@ -2081,7 +2894,7 @@
               <w:spacing w:after="40"/>
             </w:pPr>
             <w:r>
-              <w:t xml:space="preserve">Sayfa 12774</w:t>
+              <w:t xml:space="preserve">Sayfa 12772</w:t>
             </w:r>
           </w:p>
         </w:tc>
@@ -2106,7 +2919,7 @@
               <w:spacing w:after="40"/>
             </w:pPr>
             <w:r>
-              <w:t xml:space="preserve">“…as long as they don’t change the original one” ifadesini tamamen kaldırın. CC BY-NC’nin gerçekte izin verdiği hakları anlatan metni (standart metnin “License” paragrafı) koyun ve lisans sayfasına bağlantı verin.</w:t>
+              <w:t xml:space="preserve">“exclusive license agreement…” cümlesini silin. Yerine standart metni koyun. Sayfa başlığında “Copyright Transfer” ifadesi geçiyorsa “Copyright and License” olarak değiştirin.</w:t>
             </w:r>
           </w:p>
         </w:tc>
@@ -2134,7 +2947,7 @@
               <w:spacing w:after="40"/>
             </w:pPr>
             <w:r>
-              <w:t xml:space="preserve">Telif Devir Formu</w:t>
+              <w:t xml:space="preserve">Sayfa 12774</w:t>
             </w:r>
           </w:p>
         </w:tc>
@@ -2160,7 +2973,7 @@
               <w:spacing w:after="40"/>
             </w:pPr>
             <w:r>
-              <w:t xml:space="preserve">Google Drive’daki formu yayından kaldırın. Yerine 2.6’daki “Author Agreement and License to Publish” formunu koyun ve formu DergiPark içinde barındırın (Drive bağlantıları erişim sorunu çıkarabilir). Formda “transfer to the MRR Editorial Board” ve “intellectual property rights… are reserved” ifadeleri kalmamalı.</w:t>
+              <w:t xml:space="preserve">“…as long as they don’t change the original one” ifadesini tamamen kaldırın. CC BY-NC’nin gerçekte izin verdiği hakları anlatan metni (standart metnin “License” paragrafı) koyun ve lisans sayfasına bağlantı verin.</w:t>
             </w:r>
           </w:p>
         </w:tc>
@@ -2187,7 +3000,7 @@
               <w:spacing w:after="40"/>
             </w:pPr>
             <w:r>
-              <w:t xml:space="preserve">DergiPark dergi ayarları</w:t>
+              <w:t xml:space="preserve">Telif Devir Formu</w:t>
             </w:r>
           </w:p>
         </w:tc>
@@ -2212,7 +3025,7 @@
               <w:spacing w:after="40"/>
             </w:pPr>
             <w:r>
-              <w:t xml:space="preserve">Dergi yöneticisi panelindeki lisans/telif alanında CC BY-NC 4.0’ın seçili olduğunu ve telif sahibi bilgisinin “Author(s)” olduğunu kontrol edin. Makale künye sayfalarında görünen lisans bilgisi bu ayardan gelir.</w:t>
+              <w:t xml:space="preserve">Google Drive’daki formu yayından kaldırın. Yerine 2.6’daki “Author Agreement and License to Publish” formunu koyun ve formu DergiPark içinde barındırın (Drive bağlantıları erişim sorunu çıkarabilir). Formda “transfer to the MRR Editorial Board” ve “intellectual property rights… are reserved” ifadeleri kalmamalı.</w:t>
             </w:r>
           </w:p>
         </w:tc>
@@ -2240,7 +3053,7 @@
               <w:spacing w:after="40"/>
             </w:pPr>
             <w:r>
-              <w:t xml:space="preserve">Makale PDF şablonu</w:t>
+              <w:t xml:space="preserve">DergiPark dergi ayarları</w:t>
             </w:r>
           </w:p>
         </w:tc>
@@ -2266,7 +3079,7 @@
               <w:spacing w:after="40"/>
             </w:pPr>
             <w:r>
-              <w:t xml:space="preserve">Her makalenin ilk sayfasına telif notunu ve CC BY-NC 4.0 logosunu/bağlantısını ekleyin. Geçmiş sayılardaki PDF’ler eski ifadeyi (ör. “All rights reserved”, “copyright transferred”) içeriyorsa en azından son iki yılın PDF’lerini güncelleyin.</w:t>
+              <w:t xml:space="preserve">Dergi yöneticisi panelindeki lisans/telif alanında CC BY-NC 4.0’ın seçili olduğunu ve telif sahibi bilgisinin “Author(s)” olduğunu kontrol edin. Makale künye sayfalarında görünen lisans bilgisi bu ayardan gelir.</w:t>
             </w:r>
           </w:p>
         </w:tc>
@@ -2293,7 +3106,7 @@
               <w:spacing w:after="40"/>
             </w:pPr>
             <w:r>
-              <w:t xml:space="preserve">Yazar rehberi, gönderim adımları, “About”, open access sayfası</w:t>
+              <w:t xml:space="preserve">Makale PDF şablonu</w:t>
             </w:r>
           </w:p>
         </w:tc>
@@ -2318,7 +3131,7 @@
               <w:spacing w:after="40"/>
             </w:pPr>
             <w:r>
-              <w:t xml:space="preserve">Telif veya lisanstan söz eden her yerde yalnızca standart metni ya da ona bağlantı verin. Farklı özetler yazmayın.</w:t>
+              <w:t xml:space="preserve">Her makalenin ilk sayfasına telif notunu ve CC BY-NC 4.0 logosunu/bağlantısını ekleyin. Geçmiş sayılardaki PDF’ler eski ifadeyi (ör. “All rights reserved”, “copyright transferred”) içeriyorsa en azından son iki yılın PDF’lerini güncelleyin.</w:t>
             </w:r>
           </w:p>
         </w:tc>
@@ -2346,6 +3159,59 @@
               <w:spacing w:after="40"/>
             </w:pPr>
             <w:r>
+              <w:t xml:space="preserve">Yazar rehberi, gönderim adımları, “About”, open access sayfası</w:t>
+            </w:r>
+          </w:p>
+        </w:tc>
+        <w:tc>
+          <w:tcPr>
+            <w:tcW w:type="dxa" w:w="6720"/>
+            <w:tcBorders>
+              <w:top w:val="single" w:color="BFBFBF" w:sz="4"/>
+              <w:left w:val="single" w:color="BFBFBF" w:sz="4"/>
+              <w:bottom w:val="single" w:color="BFBFBF" w:sz="4"/>
+              <w:right w:val="single" w:color="BFBFBF" w:sz="4"/>
+            </w:tcBorders>
+            <w:shd w:fill="F2F6FA" w:color="auto" w:val="clear"/>
+            <w:tcMar>
+              <w:top w:type="dxa" w:w="80"/>
+              <w:left w:type="dxa" w:w="100"/>
+              <w:bottom w:type="dxa" w:w="80"/>
+              <w:right w:type="dxa" w:w="100"/>
+            </w:tcMar>
+          </w:tcPr>
+          <w:p>
+            <w:pPr>
+              <w:spacing w:after="40"/>
+            </w:pPr>
+            <w:r>
+              <w:t xml:space="preserve">Telif veya lisanstan söz eden her yerde yalnızca standart metni ya da ona bağlantı verin. Farklı özetler yazmayın.</w:t>
+            </w:r>
+          </w:p>
+        </w:tc>
+      </w:tr>
+      <w:tr>
+        <w:tc>
+          <w:tcPr>
+            <w:tcW w:type="dxa" w:w="2306"/>
+            <w:tcBorders>
+              <w:top w:val="single" w:color="BFBFBF" w:sz="4"/>
+              <w:left w:val="single" w:color="BFBFBF" w:sz="4"/>
+              <w:bottom w:val="single" w:color="BFBFBF" w:sz="4"/>
+              <w:right w:val="single" w:color="BFBFBF" w:sz="4"/>
+            </w:tcBorders>
+            <w:tcMar>
+              <w:top w:type="dxa" w:w="80"/>
+              <w:left w:type="dxa" w:w="100"/>
+              <w:bottom w:type="dxa" w:w="80"/>
+              <w:right w:type="dxa" w:w="100"/>
+            </w:tcMar>
+          </w:tcPr>
+          <w:p>
+            <w:pPr>
+              <w:spacing w:after="40"/>
+            </w:pPr>
+            <w:r>
               <w:t xml:space="preserve">Türkçe sayfalar</w:t>
             </w:r>
           </w:p>
@@ -2359,7 +3225,6 @@
               <w:bottom w:val="single" w:color="BFBFBF" w:sz="4"/>
               <w:right w:val="single" w:color="BFBFBF" w:sz="4"/>
             </w:tcBorders>
-            <w:shd w:fill="F2F6FA" w:color="auto" w:val="clear"/>
             <w:tcMar>
               <w:top w:type="dxa" w:w="80"/>
               <w:left w:type="dxa" w:w="100"/>
@@ -4099,7 +4964,7 @@
               <w:spacing w:after="40"/>
             </w:pPr>
             <w:r>
-              <w:t xml:space="preserve">“Aims &amp; Scope” sayfası açık ve güncel. Dergi adı ile kapsam uyumlu.</w:t>
+              <w:t xml:space="preserve">“Aims &amp; Scope” sayfası mevcut (tıp ve diş hekimliği). Güncel ve dil politikasıyla uyumlu olmalı.</w:t>
             </w:r>
           </w:p>
         </w:tc>
@@ -4125,7 +4990,7 @@
               <w:spacing w:after="40"/>
             </w:pPr>
             <w:r>
-              <w:t xml:space="preserve">☐</w:t>
+              <w:t xml:space="preserve">✓ Mevcut</w:t>
             </w:r>
           </w:p>
         </w:tc>
@@ -4334,7 +5199,7 @@
               <w:spacing w:after="40"/>
             </w:pPr>
             <w:r>
-              <w:t xml:space="preserve">Makale işlem/yayın ücreti alınıp alınmadığı açıkça yazılı. Ücret yoksa “The journal does not charge any article processing or submission fees.” gibi bir cümle bulunmalı.</w:t>
+              <w:t xml:space="preserve">Makale işlem/yayın ücreti alınıp alınmadığı açıkça yazılı. Sitede “ücretsiz” yazıyor, ifadeyi Bölüm 1.2’deki gibi netleştirin.</w:t>
             </w:r>
           </w:p>
         </w:tc>
@@ -4359,7 +5224,7 @@
               <w:spacing w:after="40"/>
             </w:pPr>
             <w:r>
-              <w:t xml:space="preserve">☐</w:t>
+              <w:t xml:space="preserve">✓ Mevcut</w:t>
             </w:r>
           </w:p>
         </w:tc>
@@ -4387,7 +5252,7 @@
               <w:spacing w:after="40"/>
             </w:pPr>
             <w:r>
-              <w:t xml:space="preserve">Yayın etiği</w:t>
+              <w:t xml:space="preserve">Yayın dili</w:t>
             </w:r>
           </w:p>
         </w:tc>
@@ -4413,7 +5278,7 @@
               <w:spacing w:after="40"/>
             </w:pPr>
             <w:r>
-              <w:t xml:space="preserve">COPE ilkelerine atıfla yayın etiği politikası; intihal (benzerlik) politikası ve kullanılan yazılım; çıkar çatışması, düzeltme/geri çekme politikası.</w:t>
+              <w:t xml:space="preserve">Tüm sayfalarda tek bir dil politikası (Bölüm 1.2).</w:t>
             </w:r>
           </w:p>
         </w:tc>
@@ -4439,7 +5304,7 @@
               <w:spacing w:after="40"/>
             </w:pPr>
             <w:r>
-              <w:t xml:space="preserve">☐</w:t>
+              <w:t xml:space="preserve">✗ Çelişkili</w:t>
             </w:r>
           </w:p>
         </w:tc>
@@ -4466,7 +5331,7 @@
               <w:spacing w:after="40"/>
             </w:pPr>
             <w:r>
-              <w:t xml:space="preserve">Arşivleme / uzun süreli koruma</w:t>
+              <w:t xml:space="preserve">Yayın etiği</w:t>
             </w:r>
           </w:p>
         </w:tc>
@@ -4491,7 +5356,7 @@
               <w:spacing w:after="40"/>
             </w:pPr>
             <w:r>
-              <w:t xml:space="preserve">Derginin kullandığı dijital arşivleme hizmeti (DergiPark’ın sağladığı hizmet vb.) belirtilmiş. Başvuruda da aynı bilgi verilmeli.</w:t>
+              <w:t xml:space="preserve">COPE ilkelerine atıfla yayın etiği politikası; intihal (benzerlik) politikası ve kullanılan yazılım; çıkar çatışması, düzeltme/geri çekme politikası.</w:t>
             </w:r>
           </w:p>
         </w:tc>
@@ -4544,7 +5409,7 @@
               <w:spacing w:after="40"/>
             </w:pPr>
             <w:r>
-              <w:t xml:space="preserve">Depolama (self-archiving) politikası</w:t>
+              <w:t xml:space="preserve">Arşivleme / uzun süreli koruma</w:t>
             </w:r>
           </w:p>
         </w:tc>
@@ -4570,7 +5435,7 @@
               <w:spacing w:after="40"/>
             </w:pPr>
             <w:r>
-              <w:t xml:space="preserve">Yazarların hangi sürümü (preprint, kabul edilmiş, yayımlanmış) nereye koyabileceği yazılı. Seçenek A ile uyumlu olmalı.</w:t>
+              <w:t xml:space="preserve">Derginin kullandığı dijital arşivleme hizmeti (DergiPark’ın sağladığı hizmet vb.) belirtilmiş. Başvuruda da aynı bilgi verilmeli.</w:t>
             </w:r>
           </w:p>
         </w:tc>
@@ -4623,7 +5488,7 @@
               <w:spacing w:after="40"/>
             </w:pPr>
             <w:r>
-              <w:t xml:space="preserve">Kalıcı tanımlayıcı</w:t>
+              <w:t xml:space="preserve">Depolama (self-archiving) politikası</w:t>
             </w:r>
           </w:p>
         </w:tc>
@@ -4648,7 +5513,7 @@
               <w:spacing w:after="40"/>
             </w:pPr>
             <w:r>
-              <w:t xml:space="preserve">Makalelerde DOI var ve DOI’ler çalışıyor.</w:t>
+              <w:t xml:space="preserve">Yazarların hangi sürümü (preprint, kabul edilmiş, yayımlanmış) nereye koyabileceği yazılı. Seçenek A ile uyumlu olmalı.</w:t>
             </w:r>
           </w:p>
         </w:tc>
@@ -4701,7 +5566,7 @@
               <w:spacing w:after="40"/>
             </w:pPr>
             <w:r>
-              <w:t xml:space="preserve">Yayın sayısı</w:t>
+              <w:t xml:space="preserve">Kalıcı tanımlayıcı</w:t>
             </w:r>
           </w:p>
         </w:tc>
@@ -4727,7 +5592,7 @@
               <w:spacing w:after="40"/>
             </w:pPr>
             <w:r>
-              <w:t xml:space="preserve">Son yılda en az 5 araştırma makalesi yayımlanmış.</w:t>
+              <w:t xml:space="preserve">Makalelerde DOI var ve DOI’ler çalışıyor.</w:t>
             </w:r>
           </w:p>
         </w:tc>
@@ -4753,7 +5618,7 @@
               <w:spacing w:after="40"/>
             </w:pPr>
             <w:r>
-              <w:t xml:space="preserve">☐</w:t>
+              <w:t xml:space="preserve">✓ Mevcut</w:t>
             </w:r>
           </w:p>
         </w:tc>
@@ -4780,7 +5645,7 @@
               <w:spacing w:after="40"/>
             </w:pPr>
             <w:r>
-              <w:t xml:space="preserve">Makale düzeyi lisans</w:t>
+              <w:t xml:space="preserve">Yayın sayısı</w:t>
             </w:r>
           </w:p>
         </w:tc>
@@ -4805,7 +5670,7 @@
               <w:spacing w:after="40"/>
             </w:pPr>
             <w:r>
-              <w:t xml:space="preserve">Her makale sayfasında ve PDF’inde lisans bilgisi (CC BY-NC 4.0) görünüyor.</w:t>
+              <w:t xml:space="preserve">Son yılda en az 5 araştırma makalesi yayımlanmış.</w:t>
             </w:r>
           </w:p>
         </w:tc>
@@ -4858,7 +5723,7 @@
               <w:spacing w:after="40"/>
             </w:pPr>
             <w:r>
-              <w:t xml:space="preserve">ISSN ve dergi adı</w:t>
+              <w:t xml:space="preserve">Makale düzeyi lisans</w:t>
             </w:r>
           </w:p>
         </w:tc>
@@ -4884,7 +5749,7 @@
               <w:spacing w:after="40"/>
             </w:pPr>
             <w:r>
-              <w:t xml:space="preserve">Dergi adı ve ISSN sitede, PDF’lerde ve ISSN portalında aynı.</w:t>
+              <w:t xml:space="preserve">Her makale sayfasında ve PDF’inde lisans bilgisi (CC BY-NC 4.0) görünüyor.</w:t>
             </w:r>
           </w:p>
         </w:tc>
@@ -4937,6 +5802,84 @@
               <w:spacing w:after="40"/>
             </w:pPr>
             <w:r>
+              <w:t xml:space="preserve">ISSN ve dergi adı</w:t>
+            </w:r>
+          </w:p>
+        </w:tc>
+        <w:tc>
+          <w:tcPr>
+            <w:tcW w:type="dxa" w:w="5215"/>
+            <w:tcBorders>
+              <w:top w:val="single" w:color="BFBFBF" w:sz="4"/>
+              <w:left w:val="single" w:color="BFBFBF" w:sz="4"/>
+              <w:bottom w:val="single" w:color="BFBFBF" w:sz="4"/>
+              <w:right w:val="single" w:color="BFBFBF" w:sz="4"/>
+            </w:tcBorders>
+            <w:tcMar>
+              <w:top w:type="dxa" w:w="80"/>
+              <w:left w:type="dxa" w:w="100"/>
+              <w:bottom w:type="dxa" w:w="80"/>
+              <w:right w:type="dxa" w:w="100"/>
+            </w:tcMar>
+          </w:tcPr>
+          <w:p>
+            <w:pPr>
+              <w:spacing w:after="40"/>
+            </w:pPr>
+            <w:r>
+              <w:t xml:space="preserve">Dergi adı ve ISSN sitede, PDF’lerde ve ISSN portalında aynı.</w:t>
+            </w:r>
+          </w:p>
+        </w:tc>
+        <w:tc>
+          <w:tcPr>
+            <w:tcW w:type="dxa" w:w="1204"/>
+            <w:tcBorders>
+              <w:top w:val="single" w:color="BFBFBF" w:sz="4"/>
+              <w:left w:val="single" w:color="BFBFBF" w:sz="4"/>
+              <w:bottom w:val="single" w:color="BFBFBF" w:sz="4"/>
+              <w:right w:val="single" w:color="BFBFBF" w:sz="4"/>
+            </w:tcBorders>
+            <w:tcMar>
+              <w:top w:type="dxa" w:w="80"/>
+              <w:left w:type="dxa" w:w="100"/>
+              <w:bottom w:type="dxa" w:w="80"/>
+              <w:right w:type="dxa" w:w="100"/>
+            </w:tcMar>
+          </w:tcPr>
+          <w:p>
+            <w:pPr>
+              <w:spacing w:after="40"/>
+            </w:pPr>
+            <w:r>
+              <w:t xml:space="preserve">☐</w:t>
+            </w:r>
+          </w:p>
+        </w:tc>
+      </w:tr>
+      <w:tr>
+        <w:tc>
+          <w:tcPr>
+            <w:tcW w:type="dxa" w:w="2607"/>
+            <w:tcBorders>
+              <w:top w:val="single" w:color="BFBFBF" w:sz="4"/>
+              <w:left w:val="single" w:color="BFBFBF" w:sz="4"/>
+              <w:bottom w:val="single" w:color="BFBFBF" w:sz="4"/>
+              <w:right w:val="single" w:color="BFBFBF" w:sz="4"/>
+            </w:tcBorders>
+            <w:shd w:fill="F2F6FA" w:color="auto" w:val="clear"/>
+            <w:tcMar>
+              <w:top w:type="dxa" w:w="80"/>
+              <w:left w:type="dxa" w:w="100"/>
+              <w:bottom w:type="dxa" w:w="80"/>
+              <w:right w:type="dxa" w:w="100"/>
+            </w:tcMar>
+          </w:tcPr>
+          <w:p>
+            <w:pPr>
+              <w:spacing w:after="40"/>
+            </w:pPr>
+            <w:r>
               <w:t xml:space="preserve">İki dil tutarlılığı</w:t>
             </w:r>
           </w:p>
@@ -4950,6 +5893,7 @@
               <w:bottom w:val="single" w:color="BFBFBF" w:sz="4"/>
               <w:right w:val="single" w:color="BFBFBF" w:sz="4"/>
             </w:tcBorders>
+            <w:shd w:fill="F2F6FA" w:color="auto" w:val="clear"/>
             <w:tcMar>
               <w:top w:type="dxa" w:w="80"/>
               <w:left w:type="dxa" w:w="100"/>
@@ -4975,6 +5919,7 @@
               <w:bottom w:val="single" w:color="BFBFBF" w:sz="4"/>
               <w:right w:val="single" w:color="BFBFBF" w:sz="4"/>
             </w:tcBorders>
+            <w:shd w:fill="F2F6FA" w:color="auto" w:val="clear"/>
             <w:tcMar>
               <w:top w:type="dxa" w:w="80"/>
               <w:left w:type="dxa" w:w="100"/>
@@ -5305,7 +6250,7 @@
               <w:spacing w:after="40"/>
             </w:pPr>
             <w:r>
-              <w:t xml:space="preserve">Sayfa 12771, 12772, 12774’e standart telif/lisans metnini koyun.</w:t>
+              <w:t xml:space="preserve">Ana sayfa, About, 12771, 12772 ve 12774’e standart telif/lisans metnini koyun; lisans adını düzeltin.</w:t>
             </w:r>
           </w:p>
         </w:tc>
@@ -6033,7 +6978,7 @@
               <w:spacing w:after="40"/>
             </w:pPr>
             <w:r>
-              <w:t xml:space="preserve">Türkçe arayüzdeki sayfaları İngilizce ile eşitleyin.</w:t>
+              <w:t xml:space="preserve">Türkçe arayüzdeki sayfaları İngilizce ile eşitleyin; yayın dili politikasını tekleştirin.</w:t>
             </w:r>
           </w:p>
         </w:tc>
@@ -6137,7 +7082,7 @@
               <w:spacing w:after="40"/>
             </w:pPr>
             <w:r>
-              <w:t xml:space="preserve">Son kontrol: sitede “exclusive”, “transfer”, “don’t change”, “impact factor” sözcüklerini arayın.</w:t>
+              <w:t xml:space="preserve">Son kontrol: sitede “exclusive”, “transfer”, “property of the journal”, “don’t change”, “impact factor” ifadelerini arayın.</w:t>
             </w:r>
           </w:p>
         </w:tc>
@@ -6551,6 +7496,119 @@
         </w:tc>
       </w:tr>
     </w:tbl>
+    <w:p>
+      <w:pPr>
+        <w:pStyle w:val="Heading1"/>
+        <w:spacing w:after="160" w:before="360"/>
+      </w:pPr>
+      <w:r>
+        <w:t xml:space="preserve">8. Kaynaklar</w:t>
+      </w:r>
+    </w:p>
+    <w:p>
+      <w:pPr>
+        <w:pStyle w:val="ListParagraph"/>
+        <w:numPr>
+          <w:ilvl w:val="0"/>
+          <w:numId w:val="2"/>
+        </w:numPr>
+        <w:spacing w:after="80" w:line="276"/>
+      </w:pPr>
+      <w:r>
+        <w:t xml:space="preserve">DOAJ ret e-postası (dergiye iletilen metin)</w:t>
+      </w:r>
+    </w:p>
+    <w:p>
+      <w:pPr>
+        <w:pStyle w:val="ListParagraph"/>
+        <w:numPr>
+          <w:ilvl w:val="0"/>
+          <w:numId w:val="2"/>
+        </w:numPr>
+        <w:spacing w:after="80" w:line="276"/>
+      </w:pPr>
+      <w:r>
+        <w:t xml:space="preserve">DOAJ – Guide to applying: https://doaj.org/apply/guide/</w:t>
+      </w:r>
+    </w:p>
+    <w:p>
+      <w:pPr>
+        <w:pStyle w:val="ListParagraph"/>
+        <w:numPr>
+          <w:ilvl w:val="0"/>
+          <w:numId w:val="2"/>
+        </w:numPr>
+        <w:spacing w:after="80" w:line="276"/>
+      </w:pPr>
+      <w:r>
+        <w:t xml:space="preserve">Medical Research Reports – Home: https://dergipark.org.tr/en/pub/mrr</w:t>
+      </w:r>
+    </w:p>
+    <w:p>
+      <w:pPr>
+        <w:pStyle w:val="ListParagraph"/>
+        <w:numPr>
+          <w:ilvl w:val="0"/>
+          <w:numId w:val="2"/>
+        </w:numPr>
+        <w:spacing w:after="80" w:line="276"/>
+      </w:pPr>
+      <w:r>
+        <w:t xml:space="preserve">Medical Research Reports – About: https://dergipark.org.tr/en/pub/mrr/about-journal</w:t>
+      </w:r>
+    </w:p>
+    <w:p>
+      <w:pPr>
+        <w:pStyle w:val="ListParagraph"/>
+        <w:numPr>
+          <w:ilvl w:val="0"/>
+          <w:numId w:val="2"/>
+        </w:numPr>
+        <w:spacing w:after="80" w:line="276"/>
+      </w:pPr>
+      <w:r>
+        <w:t xml:space="preserve">Medical Research Reports – Aim &amp; Scope: https://dergipark.org.tr/en/pub/mrr/aim-and-scope</w:t>
+      </w:r>
+    </w:p>
+    <w:p>
+      <w:pPr>
+        <w:pStyle w:val="ListParagraph"/>
+        <w:numPr>
+          <w:ilvl w:val="0"/>
+          <w:numId w:val="2"/>
+        </w:numPr>
+        <w:spacing w:after="80" w:line="276"/>
+      </w:pPr>
+      <w:r>
+        <w:t xml:space="preserve">Medical Research Reports – Author Guidelines: https://dergipark.org.tr/en/pub/mrr/writing-rules</w:t>
+      </w:r>
+    </w:p>
+    <w:p>
+      <w:pPr>
+        <w:pStyle w:val="ListParagraph"/>
+        <w:numPr>
+          <w:ilvl w:val="0"/>
+          <w:numId w:val="2"/>
+        </w:numPr>
+        <w:spacing w:after="80" w:line="276"/>
+      </w:pPr>
+      <w:r>
+        <w:t xml:space="preserve">Medical Research Reports – Journal Boards: https://dergipark.org.tr/en/pub/mrr/board</w:t>
+      </w:r>
+    </w:p>
+    <w:p>
+      <w:pPr>
+        <w:pStyle w:val="ListParagraph"/>
+        <w:numPr>
+          <w:ilvl w:val="0"/>
+          <w:numId w:val="2"/>
+        </w:numPr>
+        <w:spacing w:after="80" w:line="276"/>
+      </w:pPr>
+      <w:r>
+        <w:t xml:space="preserve">Medical Research Reports – Indexes: https://dergipark.org.tr/en/pub/mrr/indexes</w:t>
+      </w:r>
+    </w:p>
     <w:sectPr>
       <w:footerReference w:type="default" r:id="rId6"/>
       <w:pgSz w:w="11906" w:h="16838" w:orient="portrait"/>

</xml_diff>